<commit_message>
feat: update loop service, journal/pricing UI, support content
</commit_message>
<xml_diff>
--- a/backend/apps/api/content/nextmate_support_content.docx
+++ b/backend/apps/api/content/nextmate_support_content.docx
@@ -398,58 +398,82 @@
       </w:pPr>
       <w:proofErr w:type="spellStart"/>
       <w:r>
-        <w:t>Nexmate</w:t>
+        <w:t>Nexmate offers three plans.</w:t>
       </w:r>
       <w:proofErr w:type="spellEnd"/>
-      <w:r>
-        <w:t xml:space="preserve"> offers three tiers. Each tier includes everything in the tier below it.</w:t>
-      </w:r>
+      <w:r/>
     </w:p>
     <w:p>
       <w:pPr>
         <w:pStyle w:val="Heading2"/>
       </w:pPr>
       <w:r>
-        <w:t>Bronze plan</w:t>
-      </w:r>
-    </w:p>
-    <w:p>
-      <w:pPr>
-        <w:pStyle w:val="ListParagraph"/>
-        <w:numPr>
-          <w:ilvl w:val="0"/>
-          <w:numId w:val="2"/>
-        </w:numPr>
-        <w:spacing w:after="80"/>
-      </w:pPr>
-      <w:r>
-        <w:t>Limited daily prompt packs</w:t>
-      </w:r>
-    </w:p>
-    <w:p>
-      <w:pPr>
-        <w:pStyle w:val="ListParagraph"/>
-        <w:numPr>
-          <w:ilvl w:val="0"/>
-          <w:numId w:val="2"/>
-        </w:numPr>
-        <w:spacing w:after="80"/>
-      </w:pPr>
-      <w:r>
-        <w:t>Daily journaling</w:t>
-      </w:r>
-    </w:p>
-    <w:p>
-      <w:pPr>
-        <w:pStyle w:val="ListParagraph"/>
-        <w:numPr>
-          <w:ilvl w:val="0"/>
-          <w:numId w:val="2"/>
-        </w:numPr>
-        <w:spacing w:after="80"/>
-      </w:pPr>
-      <w:r>
-        <w:t>Basic emotion tracking</w:t>
+        <w:t>Basic plan — Free</w:t>
+      </w:r>
+    </w:p>
+    <w:p>
+      <w:pPr>
+        <w:pStyle w:val="ListParagraph"/>
+        <w:numPr>
+          <w:ilvl w:val="0"/>
+          <w:numId w:val="2"/>
+        </w:numPr>
+        <w:spacing w:after="80"/>
+      </w:pPr>
+      <w:r>
+        <w:t>Daily journaling — write freely, no Loop inclusion</w:t>
+      </w:r>
+    </w:p>
+    <w:p>
+      <w:pPr>
+        <w:pStyle w:val="ListParagraph"/>
+        <w:numPr>
+          <w:ilvl w:val="0"/>
+          <w:numId w:val="2"/>
+        </w:numPr>
+        <w:spacing w:after="80"/>
+      </w:pPr>
+      <w:r>
+        <w:t>Insights dashboard with 2–3 emotional trend graphs</w:t>
+      </w:r>
+    </w:p>
+    <w:p>
+      <w:pPr>
+        <w:pStyle w:val="ListParagraph"/>
+        <w:numPr>
+          <w:ilvl w:val="0"/>
+          <w:numId w:val="2"/>
+        </w:numPr>
+        <w:spacing w:after="80"/>
+      </w:pPr>
+      <w:r>
+        <w:t>2-day access to curated prompt packs</w:t>
+      </w:r>
+    </w:p>
+    <w:p>
+      <w:pPr>
+        <w:pStyle w:val="ListParagraph"/>
+        <w:numPr>
+          <w:ilvl w:val="0"/>
+          <w:numId w:val="2"/>
+        </w:numPr>
+        <w:spacing w:after="80"/>
+      </w:pPr>
+      <w:r>
+        <w:t>2-day access to guided reflections (Begin a Reflection)</w:t>
+      </w:r>
+    </w:p>
+    <w:p>
+      <w:pPr>
+        <w:pStyle w:val="ListParagraph"/>
+        <w:numPr>
+          <w:ilvl w:val="0"/>
+          <w:numId w:val="2"/>
+        </w:numPr>
+        <w:spacing w:after="80"/>
+      </w:pPr>
+      <w:r>
+        <w:t>AI-powered customer support bot</w:t>
       </w:r>
     </w:p>
     <w:p>
@@ -458,72 +482,72 @@
         <w:spacing w:before="200"/>
       </w:pPr>
       <w:r>
-        <w:t>Silver plan — $19/month</w:t>
-      </w:r>
-    </w:p>
-    <w:p>
-      <w:pPr>
-        <w:pStyle w:val="ListParagraph"/>
-        <w:numPr>
-          <w:ilvl w:val="0"/>
-          <w:numId w:val="2"/>
-        </w:numPr>
-        <w:spacing w:after="80"/>
-      </w:pPr>
-      <w:r>
-        <w:t>Everything in Bronze</w:t>
-      </w:r>
-    </w:p>
-    <w:p>
-      <w:pPr>
-        <w:pStyle w:val="ListParagraph"/>
-        <w:numPr>
-          <w:ilvl w:val="0"/>
-          <w:numId w:val="2"/>
-        </w:numPr>
-        <w:spacing w:after="80"/>
-      </w:pPr>
-      <w:r>
-        <w:t>Core beliefs profiling</w:t>
-      </w:r>
-    </w:p>
-    <w:p>
-      <w:pPr>
-        <w:pStyle w:val="ListParagraph"/>
-        <w:numPr>
-          <w:ilvl w:val="0"/>
-          <w:numId w:val="2"/>
-        </w:numPr>
-        <w:spacing w:after="80"/>
-      </w:pPr>
-      <w:r>
-        <w:t>Loop / pattern detection</w:t>
-      </w:r>
-    </w:p>
-    <w:p>
-      <w:pPr>
-        <w:pStyle w:val="ListParagraph"/>
-        <w:numPr>
-          <w:ilvl w:val="0"/>
-          <w:numId w:val="2"/>
-        </w:numPr>
-        <w:spacing w:after="80"/>
-      </w:pPr>
-      <w:r>
-        <w:t>Voice input &amp; output</w:t>
-      </w:r>
-    </w:p>
-    <w:p>
-      <w:pPr>
-        <w:pStyle w:val="ListParagraph"/>
-        <w:numPr>
-          <w:ilvl w:val="0"/>
-          <w:numId w:val="2"/>
-        </w:numPr>
-        <w:spacing w:after="80"/>
-      </w:pPr>
-      <w:r>
-        <w:t>Insights dashboard</w:t>
+        <w:t>Gold plan — $19 / 30 days</w:t>
+      </w:r>
+    </w:p>
+    <w:p>
+      <w:pPr>
+        <w:pStyle w:val="ListParagraph"/>
+        <w:numPr>
+          <w:ilvl w:val="0"/>
+          <w:numId w:val="2"/>
+        </w:numPr>
+        <w:spacing w:after="80"/>
+      </w:pPr>
+      <w:r>
+        <w:t>Full journaling with option to include entries in your Loop, download journal entries as a book (up to 30 days)</w:t>
+      </w:r>
+    </w:p>
+    <w:p>
+      <w:pPr>
+        <w:pStyle w:val="ListParagraph"/>
+        <w:numPr>
+          <w:ilvl w:val="0"/>
+          <w:numId w:val="2"/>
+        </w:numPr>
+        <w:spacing w:after="80"/>
+      </w:pPr>
+      <w:r>
+        <w:t>Complete insights dashboard including the Knowledge Graph, for 30 days</w:t>
+      </w:r>
+    </w:p>
+    <w:p>
+      <w:pPr>
+        <w:pStyle w:val="ListParagraph"/>
+        <w:numPr>
+          <w:ilvl w:val="0"/>
+          <w:numId w:val="2"/>
+        </w:numPr>
+        <w:spacing w:after="80"/>
+      </w:pPr>
+      <w:r>
+        <w:t>All prompt packs unlocked for 30 days</w:t>
+      </w:r>
+    </w:p>
+    <w:p>
+      <w:pPr>
+        <w:pStyle w:val="ListParagraph"/>
+        <w:numPr>
+          <w:ilvl w:val="0"/>
+          <w:numId w:val="2"/>
+        </w:numPr>
+        <w:spacing w:after="80"/>
+      </w:pPr>
+      <w:r>
+        <w:t>Guided reflections (Begin a Reflection) for 30 days</w:t>
+      </w:r>
+    </w:p>
+    <w:p>
+      <w:pPr>
+        <w:pStyle w:val="ListParagraph"/>
+        <w:numPr>
+          <w:ilvl w:val="0"/>
+          <w:numId w:val="2"/>
+        </w:numPr>
+        <w:spacing w:after="80"/>
+      </w:pPr>
+      <w:r>
+        <w:t>Visible active Loop for 30 days</w:t>
       </w:r>
     </w:p>
     <w:p>
@@ -532,72 +556,72 @@
         <w:spacing w:before="200"/>
       </w:pPr>
       <w:r>
-        <w:t>Gold plan — $39/month</w:t>
-      </w:r>
-    </w:p>
-    <w:p>
-      <w:pPr>
-        <w:pStyle w:val="ListParagraph"/>
-        <w:numPr>
-          <w:ilvl w:val="0"/>
-          <w:numId w:val="2"/>
-        </w:numPr>
-        <w:spacing w:after="80"/>
-      </w:pPr>
-      <w:r>
-        <w:t>Everything in Silver</w:t>
-      </w:r>
-    </w:p>
-    <w:p>
-      <w:pPr>
-        <w:pStyle w:val="ListParagraph"/>
-        <w:numPr>
-          <w:ilvl w:val="0"/>
-          <w:numId w:val="2"/>
-        </w:numPr>
-        <w:spacing w:after="80"/>
-      </w:pPr>
-      <w:r>
-        <w:t>Unlimited reflection history</w:t>
-      </w:r>
-    </w:p>
-    <w:p>
-      <w:pPr>
-        <w:pStyle w:val="ListParagraph"/>
-        <w:numPr>
-          <w:ilvl w:val="0"/>
-          <w:numId w:val="2"/>
-        </w:numPr>
-        <w:spacing w:after="80"/>
-      </w:pPr>
-      <w:r>
-        <w:t>Multiple journal books</w:t>
-      </w:r>
-    </w:p>
-    <w:p>
-      <w:pPr>
-        <w:pStyle w:val="ListParagraph"/>
-        <w:numPr>
-          <w:ilvl w:val="0"/>
-          <w:numId w:val="2"/>
-        </w:numPr>
-        <w:spacing w:after="80"/>
-      </w:pPr>
-      <w:r>
-        <w:t>Early access to new features</w:t>
-      </w:r>
-    </w:p>
-    <w:p>
-      <w:pPr>
-        <w:pStyle w:val="ListParagraph"/>
-        <w:numPr>
-          <w:ilvl w:val="0"/>
-          <w:numId w:val="2"/>
-        </w:numPr>
-        <w:spacing w:after="80"/>
-      </w:pPr>
-      <w:r>
-        <w:t>Custom daily questions</w:t>
+        <w:t>Platinum plan — $59 / 365 days</w:t>
+      </w:r>
+    </w:p>
+    <w:p>
+      <w:pPr>
+        <w:pStyle w:val="ListParagraph"/>
+        <w:numPr>
+          <w:ilvl w:val="0"/>
+          <w:numId w:val="2"/>
+        </w:numPr>
+        <w:spacing w:after="80"/>
+      </w:pPr>
+      <w:r>
+        <w:t>Full journaling with all options — Loop inclusion, book downloads, and more, for 365 days</w:t>
+      </w:r>
+    </w:p>
+    <w:p>
+      <w:pPr>
+        <w:pStyle w:val="ListParagraph"/>
+        <w:numPr>
+          <w:ilvl w:val="0"/>
+          <w:numId w:val="2"/>
+        </w:numPr>
+        <w:spacing w:after="80"/>
+      </w:pPr>
+      <w:r>
+        <w:t>Complete insights dashboard including the Knowledge Graph, for 365 days</w:t>
+      </w:r>
+    </w:p>
+    <w:p>
+      <w:pPr>
+        <w:pStyle w:val="ListParagraph"/>
+        <w:numPr>
+          <w:ilvl w:val="0"/>
+          <w:numId w:val="2"/>
+        </w:numPr>
+        <w:spacing w:after="80"/>
+      </w:pPr>
+      <w:r>
+        <w:t>All prompt packs unlocked for 365 days</w:t>
+      </w:r>
+    </w:p>
+    <w:p>
+      <w:pPr>
+        <w:pStyle w:val="ListParagraph"/>
+        <w:numPr>
+          <w:ilvl w:val="0"/>
+          <w:numId w:val="2"/>
+        </w:numPr>
+        <w:spacing w:after="80"/>
+      </w:pPr>
+      <w:r>
+        <w:t>Guided reflections (Begin a Reflection) for 365 days</w:t>
+      </w:r>
+    </w:p>
+    <w:p>
+      <w:pPr>
+        <w:pStyle w:val="ListParagraph"/>
+        <w:numPr>
+          <w:ilvl w:val="0"/>
+          <w:numId w:val="2"/>
+        </w:numPr>
+        <w:spacing w:after="80"/>
+      </w:pPr>
+      <w:r>
+        <w:t>Visible active Loop for 365 days</w:t>
       </w:r>
     </w:p>
     <w:sectPr>

</xml_diff>

<commit_message>
feat: update support content to deliver the knowledge of the menu too
</commit_message>
<xml_diff>
--- a/backend/apps/api/content/nextmate_support_content.docx
+++ b/backend/apps/api/content/nextmate_support_content.docx
@@ -298,7 +298,7 @@
         <w:spacing w:after="80"/>
       </w:pPr>
       <w:r>
-        <w:t>Daily prompt packs: short daily reflection prompts; answering them over time builds a running personal summary on your Profile page.</w:t>
+        <w:t>Discover Yourself: short daily reflection prompts and curated prompt packs; answering them over time builds a running personal summary on your Profile page.</w:t>
       </w:r>
     </w:p>
     <w:p>
@@ -447,7 +447,7 @@
         <w:spacing w:after="80"/>
       </w:pPr>
       <w:r>
-        <w:t>2-day access to curated prompt packs</w:t>
+        <w:t>2-day access to Discover Yourself (prompt packs)</w:t>
       </w:r>
     </w:p>
     <w:p>
@@ -521,7 +521,7 @@
         <w:spacing w:after="80"/>
       </w:pPr>
       <w:r>
-        <w:t>All prompt packs unlocked for 30 days</w:t>
+        <w:t>Discover Yourself (all prompt packs) unlocked for 30 days</w:t>
       </w:r>
     </w:p>
     <w:p>
@@ -595,7 +595,7 @@
         <w:spacing w:after="80"/>
       </w:pPr>
       <w:r>
-        <w:t>All prompt packs unlocked for 365 days</w:t>
+        <w:t>Discover Yourself (all prompt packs) unlocked for 365 days</w:t>
       </w:r>
     </w:p>
     <w:p>
@@ -622,6 +622,151 @@
       </w:pPr>
       <w:r>
         <w:t>Visible active Loop for 365 days</w:t>
+      </w:r>
+    </w:p>
+    <w:p>
+      <w:pPr>
+        <w:pStyle w:val="Heading1"/>
+      </w:pPr>
+      <w:r>
+        <w:t>Menu &amp; Screens</w:t>
+      </w:r>
+    </w:p>
+    <w:p>
+      <w:pPr>
+        <w:spacing w:after="160"/>
+      </w:pPr>
+      <w:proofErr w:type="spellStart"/>
+      <w:r>
+        <w:t>Nexmate has six main sections accessible from the sidebar navigation.</w:t>
+      </w:r>
+      <w:proofErr w:type="spellEnd"/>
+      <w:r/>
+    </w:p>
+    <w:p>
+      <w:pPr>
+        <w:pStyle w:val="Heading2"/>
+      </w:pPr>
+      <w:r>
+        <w:t>Home</w:t>
+      </w:r>
+    </w:p>
+    <w:p>
+      <w:pPr>
+        <w:pStyle w:val="ListParagraph"/>
+        <w:numPr>
+          <w:ilvl w:val="0"/>
+          <w:numId w:val="2"/>
+        </w:numPr>
+        <w:spacing w:after="80"/>
+      </w:pPr>
+      <w:r>
+        <w:t>The Home screen is your daily starting point. It shows your current date, a Begin a Reflection button to start a new conversation thread, your check-in streak, daily questions based on your past conversations, and a quick summary of your recent emotional patterns.</w:t>
+      </w:r>
+    </w:p>
+    <w:p>
+      <w:pPr>
+        <w:pStyle w:val="Heading2"/>
+      </w:pPr>
+      <w:r>
+        <w:t>Journal</w:t>
+      </w:r>
+    </w:p>
+    <w:p>
+      <w:pPr>
+        <w:pStyle w:val="ListParagraph"/>
+        <w:numPr>
+          <w:ilvl w:val="0"/>
+          <w:numId w:val="2"/>
+        </w:numPr>
+        <w:spacing w:after="80"/>
+      </w:pPr>
+      <w:r>
+        <w:t>The Journal screen is your personal writing space. You can write free-form entries, choose from pre-built templates (gratitude, daily reflection, goal tracking, emotional check-ins), tag moods, organize entries into custom books, and track your daily writing streak. You can also download a single entry as a PDF (Current Entry) or export your entire book as a PDF (Complete Book).</w:t>
+      </w:r>
+    </w:p>
+    <w:p>
+      <w:pPr>
+        <w:pStyle w:val="Heading2"/>
+      </w:pPr>
+      <w:r>
+        <w:t>Discover Yourself</w:t>
+      </w:r>
+    </w:p>
+    <w:p>
+      <w:pPr>
+        <w:pStyle w:val="ListParagraph"/>
+        <w:numPr>
+          <w:ilvl w:val="0"/>
+          <w:numId w:val="2"/>
+        </w:numPr>
+        <w:spacing w:after="80"/>
+      </w:pPr>
+      <w:r>
+        <w:t>Discover Yourself (formerly Prompt Packs) is a curated collection of short daily reflection prompts grouped by theme or category. Answering prompts over time builds a running personal summary visible on your Profile page. It helps you explore different aspects of yourself — from values and habits to emotions and goals.</w:t>
+      </w:r>
+    </w:p>
+    <w:p>
+      <w:pPr>
+        <w:pStyle w:val="Heading2"/>
+      </w:pPr>
+      <w:r>
+        <w:t>Loops</w:t>
+      </w:r>
+    </w:p>
+    <w:p>
+      <w:pPr>
+        <w:pStyle w:val="ListParagraph"/>
+        <w:numPr>
+          <w:ilvl w:val="0"/>
+          <w:numId w:val="2"/>
+        </w:numPr>
+        <w:spacing w:after="80"/>
+      </w:pPr>
+      <w:r>
+        <w:t>Loops shows the recurring patterns Nexmate has detected across your conversations — things like a core belief, a repeated trigger, or a habitual reaction. Each loop shows its name, how many times it has appeared, its strength, its current state (active or resolved), and a timeline of when it was detected. You can tap into any loop to see the full detail and start a reflection thread directly from it.</w:t>
+      </w:r>
+    </w:p>
+    <w:p>
+      <w:pPr>
+        <w:pStyle w:val="Heading2"/>
+      </w:pPr>
+      <w:r>
+        <w:t>Insights</w:t>
+      </w:r>
+    </w:p>
+    <w:p>
+      <w:pPr>
+        <w:pStyle w:val="ListParagraph"/>
+        <w:numPr>
+          <w:ilvl w:val="0"/>
+          <w:numId w:val="2"/>
+        </w:numPr>
+        <w:spacing w:after="80"/>
+      </w:pPr>
+      <w:r>
+        <w:t>Insights gives you a visual overview of your emotional and reflection data. It includes mood trend graphs, a weekly report, a knowledge graph connecting your recurring themes and beliefs, and breakdowns of your most common emotions, triggers, and topics over time. Available in full for Gold and Platinum plan users.</w:t>
+      </w:r>
+    </w:p>
+    <w:p>
+      <w:pPr>
+        <w:pStyle w:val="Heading2"/>
+      </w:pPr>
+      <w:r>
+        <w:t>Profile</w:t>
+      </w:r>
+    </w:p>
+    <w:p>
+      <w:pPr>
+        <w:pStyle w:val="ListParagraph"/>
+        <w:numPr>
+          <w:ilvl w:val="0"/>
+          <w:numId w:val="2"/>
+        </w:numPr>
+        <w:spacing w:after="80"/>
+      </w:pPr>
+      <w:r>
+        <w:t>Your Profile page shows your personal summary built from your Discover Yourself answers, your account details, and your current plan. You can update your name, email, and password here, and manage your subscription.</w:t>
       </w:r>
     </w:p>
     <w:sectPr>

</xml_diff>